<commit_message>
Portfolio 2: final report (docx, pdf) and notebook synced with report results
</commit_message>
<xml_diff>
--- a/Portfolio_Assessment_2_105706565_NguyenNamKhanh.docx
+++ b/Portfolio_Assessment_2_105706565_NguyenNamKhanh.docx
@@ -279,21 +279,7 @@
           <w:rFonts w:ascii="Times New Roman" w:eastAsia="Times New Roman" w:hAnsi="Times New Roman" w:cs="Times New Roman"/>
           <w:sz w:val="24"/>
         </w:rPr>
-        <w:t>This repo</w:t>
-      </w:r>
-      <w:r>
-        <w:rPr>
-          <w:rFonts w:ascii="Times New Roman" w:eastAsia="Times New Roman" w:hAnsi="Times New Roman" w:cs="Times New Roman"/>
-          <w:sz w:val="24"/>
-        </w:rPr>
-        <w:t xml:space="preserve">rt continues from Portfolio 1. It reuses the cleaned dataset (8,448 hours after removing 295 non-functioning hours and 17 rows with humidity = 0) and the balanced three-class target demand_class created with pd.qcut. All results below were produced by the </w:t>
-      </w:r>
-      <w:r>
-        <w:rPr>
-          <w:rFonts w:ascii="Times New Roman" w:eastAsia="Times New Roman" w:hAnsi="Times New Roman" w:cs="Times New Roman"/>
-          <w:sz w:val="24"/>
-        </w:rPr>
-        <w:t>accompanying notebook (random_state = 42, 70/30 stratified train-test split, 5-fold cross-validation).</w:t>
+        <w:t>This report continues from Portfolio 1. It reuses the cleaned dataset (8,448 hours after removing 295 non-functioning hours and 17 rows with humidity = 0) and the balanced three-class target demand_class created with pd.qcut. All results below were produced by the accompanying notebook (random_state = 42, 70/30 stratified train-test split, 5-fold cross-validation).</w:t>
       </w:r>
     </w:p>
     <w:p>
@@ -356,14 +342,7 @@
           <w:rFonts w:ascii="Times New Roman" w:eastAsia="Times New Roman" w:hAnsi="Times New Roman" w:cs="Times New Roman"/>
           <w:sz w:val="24"/>
         </w:rPr>
-        <w:t xml:space="preserve"> the target is right-skewed, with skewness = 1.14 and mean 729.8 well abov</w:t>
-      </w:r>
-      <w:r>
-        <w:rPr>
-          <w:rFonts w:ascii="Times New Roman" w:eastAsia="Times New Roman" w:hAnsi="Times New Roman" w:cs="Times New Roman"/>
-          <w:sz w:val="24"/>
-        </w:rPr>
-        <w:t>e the median 544.5 after cleaning (P1 §3, Fig. 2). Most hours have low to moderate demand and only a few reach very high demand.</w:t>
+        <w:t xml:space="preserve"> the target is right-skewed, with skewness = 1.14 and mean 729.8 well above the median 544.5 after cleaning (P1 §3, Fig. 2). Most hours have low to moderate demand and only a few reach very high demand.</w:t>
       </w:r>
     </w:p>
     <w:p>
@@ -410,15 +389,7 @@
           <w:b/>
           <w:sz w:val="24"/>
         </w:rPr>
-        <w:t>Mediu</w:t>
-      </w:r>
-      <w:r>
-        <w:rPr>
-          <w:rFonts w:ascii="Times New Roman" w:eastAsia="Times New Roman" w:hAnsi="Times New Roman" w:cs="Times New Roman"/>
-          <w:b/>
-          <w:sz w:val="24"/>
-        </w:rPr>
-        <w:t>m (286–896)</w:t>
+        <w:t>Medium (286–896)</w:t>
       </w:r>
       <w:r>
         <w:rPr>
@@ -488,21 +459,7 @@
           <w:rFonts w:ascii="Times New Roman" w:eastAsia="Times New Roman" w:hAnsi="Times New Roman" w:cs="Times New Roman"/>
           <w:sz w:val="24"/>
         </w:rPr>
-        <w:t xml:space="preserve"> because of the skew, equal-width bins (pd.cut) would place ab</w:t>
-      </w:r>
-      <w:r>
-        <w:rPr>
-          <w:rFonts w:ascii="Times New Roman" w:eastAsia="Times New Roman" w:hAnsi="Times New Roman" w:cs="Times New Roman"/>
-          <w:sz w:val="24"/>
-        </w:rPr>
-        <w:t>out 79% of hours in Low and only 1.9% (161 hours) in High (P1 §1). A model could then reach high accuracy while ignoring the peak-demand hours that matter most to operators. Three classes also map to operational actions: off-peak maintenance, normal servic</w:t>
-      </w:r>
-      <w:r>
-        <w:rPr>
-          <w:rFonts w:ascii="Times New Roman" w:eastAsia="Times New Roman" w:hAnsi="Times New Roman" w:cs="Times New Roman"/>
-          <w:sz w:val="24"/>
-        </w:rPr>
-        <w:t>e, and pre-emptive rebalancing.</w:t>
+        <w:t xml:space="preserve"> because of the skew, equal-width bins (pd.cut) would place about 79% of hours in Low and only 1.9% (161 hours) in High (P1 §1). A model could then reach high accuracy while ignoring the peak-demand hours that matter most to operators. Three classes also map to operational actions: off-peak maintenance, normal service, and pre-emptive rebalancing.</w:t>
       </w:r>
     </w:p>
     <w:p>
@@ -542,21 +499,7 @@
           <w:rFonts w:ascii="Times New Roman" w:eastAsia="Times New Roman" w:hAnsi="Times New Roman" w:cs="Times New Roman"/>
           <w:sz w:val="24"/>
         </w:rPr>
-        <w:t xml:space="preserve">Instead of applying one scaler to every column, each numerical feature was profiled using the distribution </w:t>
-      </w:r>
-      <w:r>
-        <w:rPr>
-          <w:rFonts w:ascii="Times New Roman" w:eastAsia="Times New Roman" w:hAnsi="Times New Roman" w:cs="Times New Roman"/>
-          <w:sz w:val="24"/>
-        </w:rPr>
-        <w:t>statistics from the EDA (P1 §3, Table 2 and Fig. 4) plus IQR-outlier % and zero %. A scaler was then chosen by a documented rule: heavily zero-inflated and skewed features get log1p + MinMaxScaler; features with more than 1% outliers get RobustScaler; flat</w:t>
-      </w:r>
-      <w:r>
-        <w:rPr>
-          <w:rFonts w:ascii="Times New Roman" w:eastAsia="Times New Roman" w:hAnsi="Times New Roman" w:cs="Times New Roman"/>
-          <w:sz w:val="24"/>
-        </w:rPr>
-        <w:t xml:space="preserve"> or bounded distributions get MinMaxScaler; near-symmetric features get StandardScaler.</w:t>
+        <w:t>Instead of applying one scaler to every column, each numerical feature was profiled using the distribution statistics from the EDA (P1 §3, Table 2 and Fig. 4) plus IQR-outlier % and zero %. A scaler was then chosen by a documented rule: heavily zero-inflated and skewed features get log1p + MinMaxScaler; features with more than 1% outliers get RobustScaler; flat or bounded distributions get MinMaxScaler; near-symmetric features get StandardScaler.</w:t>
       </w:r>
     </w:p>
     <w:p>
@@ -1655,14 +1598,7 @@
                 <w:rFonts w:ascii="Times New Roman" w:eastAsia="Times New Roman" w:hAnsi="Times New Roman" w:cs="Times New Roman"/>
                 <w:sz w:val="16"/>
               </w:rPr>
-              <w:t xml:space="preserve">Zero at night </w:t>
-            </w:r>
-            <w:r>
-              <w:rPr>
-                <w:rFonts w:ascii="Times New Roman" w:eastAsia="Times New Roman" w:hAnsi="Times New Roman" w:cs="Times New Roman"/>
-                <w:sz w:val="16"/>
-              </w:rPr>
-              <w:t>(49%), many outliers</w:t>
+              <w:t>Zero at night (49%), many outliers</w:t>
             </w:r>
           </w:p>
         </w:tc>
@@ -1960,15 +1896,7 @@
           <w:b/>
           <w:sz w:val="20"/>
         </w:rPr>
-        <w:t xml:space="preserve">Table 2. Summary statistics before and </w:t>
-      </w:r>
-      <w:r>
-        <w:rPr>
-          <w:rFonts w:ascii="Times New Roman" w:eastAsia="Times New Roman" w:hAnsi="Times New Roman" w:cs="Times New Roman"/>
-          <w:b/>
-          <w:sz w:val="20"/>
-        </w:rPr>
-        <w:t>after scaling</w:t>
+        <w:t>Table 2. Summary statistics before and after scaling</w:t>
       </w:r>
     </w:p>
     <w:tbl>
@@ -2529,14 +2457,7 @@
                 <w:rFonts w:ascii="Times New Roman" w:eastAsia="Times New Roman" w:hAnsi="Times New Roman" w:cs="Times New Roman"/>
                 <w:sz w:val="16"/>
               </w:rPr>
-              <w:t xml:space="preserve">−2.37 – </w:t>
-            </w:r>
-            <w:r>
-              <w:rPr>
-                <w:rFonts w:ascii="Times New Roman" w:eastAsia="Times New Roman" w:hAnsi="Times New Roman" w:cs="Times New Roman"/>
-                <w:sz w:val="16"/>
-              </w:rPr>
-              <w:t>1.95</w:t>
+              <w:t>−2.37 – 1.95</w:t>
             </w:r>
           </w:p>
         </w:tc>
@@ -3440,14 +3361,7 @@
           <w:rFonts w:ascii="Times New Roman" w:eastAsia="Times New Roman" w:hAnsi="Times New Roman" w:cs="Times New Roman"/>
           <w:sz w:val="24"/>
         </w:rPr>
-        <w:t xml:space="preserve"> visibility and solar_radiati</w:t>
-      </w:r>
-      <w:r>
-        <w:rPr>
-          <w:rFonts w:ascii="Times New Roman" w:eastAsia="Times New Roman" w:hAnsi="Times New Roman" w:cs="Times New Roman"/>
-          <w:sz w:val="24"/>
-        </w:rPr>
-        <w:t>on keep exactly the same histogram shape; only the axis changes (Figure 1).</w:t>
+        <w:t xml:space="preserve"> visibility and solar_radiation keep exactly the same histogram shape; only the axis changes (Figure 1).</w:t>
       </w:r>
     </w:p>
     <w:p>
@@ -3471,14 +3385,7 @@
           <w:rFonts w:ascii="Times New Roman" w:eastAsia="Times New Roman" w:hAnsi="Times New Roman" w:cs="Times New Roman"/>
           <w:sz w:val="24"/>
         </w:rPr>
-        <w:t xml:space="preserve"> the extreme tail (max 35 mm) is compressed, so the rare heavy-rain hours no longer dominate. The zero spike remains, which is why the binary i</w:t>
-      </w:r>
-      <w:r>
-        <w:rPr>
-          <w:rFonts w:ascii="Times New Roman" w:eastAsia="Times New Roman" w:hAnsi="Times New Roman" w:cs="Times New Roman"/>
-          <w:sz w:val="24"/>
-        </w:rPr>
-        <w:t>s_raining flag was added in Section 3.</w:t>
+        <w:t xml:space="preserve"> the extreme tail (max 35 mm) is compressed, so the rare heavy-rain hours no longer dominate. The zero spike remains, which is why the binary is_raining flag was added in Section 3.</w:t>
       </w:r>
     </w:p>
     <w:p>
@@ -3540,14 +3447,7 @@
           <w:rFonts w:ascii="Times New Roman" w:eastAsia="Times New Roman" w:hAnsi="Times New Roman" w:cs="Times New Roman"/>
           <w:sz w:val="24"/>
         </w:rPr>
-        <w:t xml:space="preserve"> → one-hot encoding (season_Autumn, season_Spring, season_Summer, season_Winter). Seasons are nominal and rough</w:t>
-      </w:r>
-      <w:r>
-        <w:rPr>
-          <w:rFonts w:ascii="Times New Roman" w:eastAsia="Times New Roman" w:hAnsi="Times New Roman" w:cs="Times New Roman"/>
-          <w:sz w:val="24"/>
-        </w:rPr>
-        <w:t>ly balanced (P1 Fig. 5), and label encoding would impose a false order.</w:t>
+        <w:t xml:space="preserve"> → one-hot encoding (season_Autumn, season_Spring, season_Summer, season_Winter). Seasons are nominal and roughly balanced (P1 Fig. 5), and label encoding would impose a false order.</w:t>
       </w:r>
     </w:p>
     <w:p>
@@ -3629,15 +3529,7 @@
           <w:b/>
           <w:sz w:val="26"/>
         </w:rPr>
-        <w:t>3. Feature E</w:t>
-      </w:r>
-      <w:r>
-        <w:rPr>
-          <w:rFonts w:ascii="Times New Roman" w:eastAsia="Times New Roman" w:hAnsi="Times New Roman" w:cs="Times New Roman"/>
-          <w:b/>
-          <w:sz w:val="26"/>
-        </w:rPr>
-        <w:t>ngineering</w:t>
+        <w:t>3. Feature Engineering</w:t>
       </w:r>
     </w:p>
     <w:p>
@@ -3813,14 +3705,7 @@
                 <w:rFonts w:ascii="Times New Roman" w:eastAsia="Times New Roman" w:hAnsi="Times New Roman" w:cs="Times New Roman"/>
                 <w:sz w:val="16"/>
               </w:rPr>
-              <w:t>tem</w:t>
-            </w:r>
-            <w:r>
-              <w:rPr>
-                <w:rFonts w:ascii="Times New Roman" w:eastAsia="Times New Roman" w:hAnsi="Times New Roman" w:cs="Times New Roman"/>
-                <w:sz w:val="16"/>
-              </w:rPr>
-              <w:t>p_x_hour</w:t>
+              <w:t>temp_x_hour</w:t>
             </w:r>
           </w:p>
         </w:tc>
@@ -4159,14 +4044,7 @@
                 <w:rFonts w:ascii="Times New Roman" w:eastAsia="Times New Roman" w:hAnsi="Times New Roman" w:cs="Times New Roman"/>
                 <w:sz w:val="16"/>
               </w:rPr>
-              <w:t xml:space="preserve">Separates </w:t>
-            </w:r>
-            <w:r>
-              <w:rPr>
-                <w:rFonts w:ascii="Times New Roman" w:eastAsia="Times New Roman" w:hAnsi="Times New Roman" w:cs="Times New Roman"/>
-                <w:sz w:val="16"/>
-              </w:rPr>
-              <w:t>commuting days from leisure days</w:t>
+              <w:t>Separates commuting days from leisure days</w:t>
             </w:r>
           </w:p>
         </w:tc>
@@ -4338,14 +4216,7 @@
                 <w:rFonts w:ascii="Times New Roman" w:eastAsia="Times New Roman" w:hAnsi="Times New Roman" w:cs="Times New Roman"/>
                 <w:sz w:val="16"/>
               </w:rPr>
-              <w:t xml:space="preserve">~94% of </w:t>
-            </w:r>
-            <w:r>
-              <w:rPr>
-                <w:rFonts w:ascii="Times New Roman" w:eastAsia="Times New Roman" w:hAnsi="Times New Roman" w:cs="Times New Roman"/>
-                <w:sz w:val="16"/>
-              </w:rPr>
-              <w:t>rainfall values are 0 (P1 §3); demand drops 766 → 167 when raining (P1 §6)</w:t>
+              <w:t>~94% of rainfall values are 0 (P1 §3); demand drops 766 → 167 when raining (P1 §6)</w:t>
             </w:r>
           </w:p>
         </w:tc>
@@ -4458,14 +4329,7 @@
                 <w:rFonts w:ascii="Times New Roman" w:eastAsia="Times New Roman" w:hAnsi="Times New Roman" w:cs="Times New Roman"/>
                 <w:sz w:val="16"/>
               </w:rPr>
-              <w:t xml:space="preserve">Wet </w:t>
-            </w:r>
-            <w:r>
-              <w:rPr>
-                <w:rFonts w:ascii="Times New Roman" w:eastAsia="Times New Roman" w:hAnsi="Times New Roman" w:cs="Times New Roman"/>
-                <w:sz w:val="16"/>
-              </w:rPr>
-              <w:t>roads for the whole day, not just the current hour</w:t>
+              <w:t>Wet roads for the whole day, not just the current hour</w:t>
             </w:r>
           </w:p>
         </w:tc>
@@ -4515,14 +4379,7 @@
           <w:rFonts w:ascii="Times New Roman" w:eastAsia="Times New Roman" w:hAnsi="Times New Roman" w:cs="Times New Roman"/>
           <w:sz w:val="24"/>
         </w:rPr>
-        <w:t xml:space="preserve"> temp_x_hour → StandardScaler; daily_rainfall → log1p + MinMaxScaler; the others are already bounded (sin/cos in [−1, 1], flags in {0, 1}). The engineered matrix X_eng has </w:t>
-      </w:r>
-      <w:r>
-        <w:rPr>
-          <w:rFonts w:ascii="Times New Roman" w:eastAsia="Times New Roman" w:hAnsi="Times New Roman" w:cs="Times New Roman"/>
-          <w:sz w:val="24"/>
-        </w:rPr>
-        <w:t>8,448 × 21 columns.</w:t>
+        <w:t xml:space="preserve"> temp_x_hour → StandardScaler; daily_rainfall → log1p + MinMaxScaler; the others are already bounded (sin/cos in [−1, 1], flags in {0, 1}). The engineered matrix X_eng has 8,448 × 21 columns.</w:t>
       </w:r>
     </w:p>
     <w:p>
@@ -4546,14 +4403,7 @@
           <w:rFonts w:ascii="Times New Roman" w:eastAsia="Times New Roman" w:hAnsi="Times New Roman" w:cs="Times New Roman"/>
           <w:sz w:val="24"/>
         </w:rPr>
-        <w:t xml:space="preserve"> temp_x_hour (0.700) is now the strongest single predictor, ahead of temperature (0.563). hour_sin (−0.448) captures the daily cycle better than raw hour (0.425), and is_raining (−0.223) is stronger than rainfal</w:t>
-      </w:r>
-      <w:r>
-        <w:rPr>
-          <w:rFonts w:ascii="Times New Roman" w:eastAsia="Times New Roman" w:hAnsi="Times New Roman" w:cs="Times New Roman"/>
-          <w:sz w:val="24"/>
-        </w:rPr>
-        <w:t>l amount (−0.129), confirming the P1 finding that whether it rains matters more than how much.</w:t>
+        <w:t xml:space="preserve"> temp_x_hour (0.700) is now the strongest single predictor, ahead of temperature (0.563). hour_sin (−0.448) captures the daily cycle better than raw hour (0.425), and is_raining (−0.223) is stronger than rainfall amount (−0.129), confirming the P1 finding that whether it rains matters more than how much.</w:t>
       </w:r>
     </w:p>
     <w:p>
@@ -4577,14 +4427,7 @@
           <w:rFonts w:ascii="Times New Roman" w:eastAsia="Times New Roman" w:hAnsi="Times New Roman" w:cs="Times New Roman"/>
           <w:sz w:val="24"/>
         </w:rPr>
-        <w:t xml:space="preserve"> adding these features raised Decision Tree accuracy by 4.34 points (Section 5), and three of the five most important tree features are engine</w:t>
-      </w:r>
-      <w:r>
-        <w:rPr>
-          <w:rFonts w:ascii="Times New Roman" w:eastAsia="Times New Roman" w:hAnsi="Times New Roman" w:cs="Times New Roman"/>
-          <w:sz w:val="24"/>
-        </w:rPr>
-        <w:t>ered (Figure 3).</w:t>
+        <w:t xml:space="preserve"> adding these features raised Decision Tree accuracy by 4.34 points (Section 5), and three of the five most important tree features are engineered (Figure 3).</w:t>
       </w:r>
     </w:p>
     <w:p>
@@ -4608,14 +4451,7 @@
           <w:rFonts w:ascii="Times New Roman" w:eastAsia="Times New Roman" w:hAnsi="Times New Roman" w:cs="Times New Roman"/>
           <w:sz w:val="24"/>
         </w:rPr>
-        <w:t xml:space="preserve"> four pairs exceed |r| &gt; 0.7: temperature–dew_point (0.915), temperature–temp_x_hour (0.798), hour–hour_sin (−0.776) and solar_radiation–hour_cos (−0.705). Some engineered features are therefore partly alternatives to the</w:t>
-      </w:r>
-      <w:r>
-        <w:rPr>
-          <w:rFonts w:ascii="Times New Roman" w:eastAsia="Times New Roman" w:hAnsi="Times New Roman" w:cs="Times New Roman"/>
-          <w:sz w:val="24"/>
-        </w:rPr>
-        <w:t xml:space="preserve"> originals. This matters for correlation-based selection (Sections 5 and 8) but much less for trees and RBF-SVM.</w:t>
+        <w:t xml:space="preserve"> four pairs exceed |r| &gt; 0.7: temperature–dew_point (0.915), temperature–temp_x_hour (0.798), hour–hour_sin (−0.776) and solar_radiation–hour_cos (−0.705). Some engineered features are therefore partly alternatives to the originals. This matters for correlation-based selection (Sections 5 and 8) but much less for trees and RBF-SVM.</w:t>
       </w:r>
     </w:p>
     <w:p>
@@ -4641,14 +4477,7 @@
           <w:rFonts w:ascii="Times New Roman" w:eastAsia="Times New Roman" w:hAnsi="Times New Roman" w:cs="Times New Roman"/>
           <w:sz w:val="24"/>
         </w:rPr>
-        <w:t>Five DecisionTreeClassifier models (default hyperparameters, random_state = 42) were trained, one per feature set, o</w:t>
-      </w:r>
-      <w:r>
-        <w:rPr>
-          <w:rFonts w:ascii="Times New Roman" w:eastAsia="Times New Roman" w:hAnsi="Times New Roman" w:cs="Times New Roman"/>
-          <w:sz w:val="24"/>
-        </w:rPr>
-        <w:t>n the same stratified 70/30 split (5,913 training / 2,535 test hours):</w:t>
+        <w:t>Five DecisionTreeClassifier models (default hyperparameters, random_state = 42) were trained, one per feature set, on the same stratified 70/30 split (5,913 training / 2,535 test hours):</w:t>
       </w:r>
     </w:p>
     <w:p>
@@ -5260,15 +5089,7 @@
           <w:b/>
           <w:sz w:val="24"/>
         </w:rPr>
-        <w:t xml:space="preserve">Which feature set performed best and </w:t>
-      </w:r>
-      <w:r>
-        <w:rPr>
-          <w:rFonts w:ascii="Times New Roman" w:eastAsia="Times New Roman" w:hAnsi="Times New Roman" w:cs="Times New Roman"/>
-          <w:b/>
-          <w:sz w:val="24"/>
-        </w:rPr>
-        <w:t>why?</w:t>
+        <w:t>Which feature set performed best and why?</w:t>
       </w:r>
     </w:p>
     <w:p>
@@ -5292,14 +5113,7 @@
           <w:rFonts w:ascii="Times New Roman" w:eastAsia="Times New Roman" w:hAnsi="Times New Roman" w:cs="Times New Roman"/>
           <w:sz w:val="24"/>
         </w:rPr>
-        <w:t>, +4.34 points over the original features. temp_x_hour, hour_sin/cos and rush_workday encode the weather × time interaction and the commuting peaks directly, so the tree needs fewer, cleaner splits to s</w:t>
-      </w:r>
-      <w:r>
-        <w:rPr>
-          <w:rFonts w:ascii="Times New Roman" w:eastAsia="Times New Roman" w:hAnsi="Times New Roman" w:cs="Times New Roman"/>
-          <w:sz w:val="24"/>
-        </w:rPr>
-        <w:t>eparate the classes.</w:t>
+        <w:t>, +4.34 points over the original features. temp_x_hour, hour_sin/cos and rush_workday encode the weather × time interaction and the commuting peaks directly, so the tree needs fewer, cleaner splits to separate the classes.</w:t>
       </w:r>
     </w:p>
     <w:p>
@@ -5347,14 +5161,7 @@
           <w:rFonts w:ascii="Times New Roman" w:eastAsia="Times New Roman" w:hAnsi="Times New Roman" w:cs="Times New Roman"/>
           <w:sz w:val="24"/>
         </w:rPr>
-        <w:t xml:space="preserve"> The five features are redundant with each other (two temperature-like, two hour-like, plus dew point), while useful signals such as season, rain and holiday are dropped. Ranking features one at a time by co</w:t>
-      </w:r>
-      <w:r>
-        <w:rPr>
-          <w:rFonts w:ascii="Times New Roman" w:eastAsia="Times New Roman" w:hAnsi="Times New Roman" w:cs="Times New Roman"/>
-          <w:sz w:val="24"/>
-        </w:rPr>
-        <w:t>rrelation ignores this redundancy.</w:t>
+        <w:t xml:space="preserve"> The five features are redundant with each other (two temperature-like, two hour-like, plus dew point), while useful signals such as season, rain and holiday are dropped. Ranking features one at a time by correlation ignores this redundancy.</w:t>
       </w:r>
     </w:p>
     <w:p>
@@ -5393,15 +5200,7 @@
           <w:sz w:val="24"/>
         </w:rPr>
         <w:lastRenderedPageBreak/>
-        <w:t>Feature importance o</w:t>
-      </w:r>
-      <w:r>
-        <w:rPr>
-          <w:rFonts w:ascii="Times New Roman" w:eastAsia="Times New Roman" w:hAnsi="Times New Roman" w:cs="Times New Roman"/>
-          <w:b/>
-          <w:sz w:val="24"/>
-        </w:rPr>
-        <w:t>f the best model (Set 3):</w:t>
+        <w:t>Feature importance of the best model (Set 3):</w:t>
       </w:r>
     </w:p>
     <w:p>
@@ -5486,14 +5285,7 @@
           <w:rFonts w:ascii="Times New Roman" w:eastAsia="Times New Roman" w:hAnsi="Times New Roman" w:cs="Times New Roman"/>
           <w:sz w:val="24"/>
         </w:rPr>
-        <w:t xml:space="preserve"> with importance 0.280, about twice that of temperature (0.142), followed by humidity (0.100), rush_workday (0.067) and hour_sin (0.056). T</w:t>
-      </w:r>
-      <w:r>
-        <w:rPr>
-          <w:rFonts w:ascii="Times New Roman" w:eastAsia="Times New Roman" w:hAnsi="Times New Roman" w:cs="Times New Roman"/>
-          <w:sz w:val="24"/>
-        </w:rPr>
-        <w:t>hree of the top five features are engineered, which validates the feature engineering of Section 3.</w:t>
+        <w:t xml:space="preserve"> with importance 0.280, about twice that of temperature (0.142), followed by humidity (0.100), rush_workday (0.067) and hour_sin (0.056). Three of the top five features are engineered, which validates the feature engineering of Section 3.</w:t>
       </w:r>
     </w:p>
     <w:p>
@@ -5509,14 +5301,7 @@
           <w:rFonts w:ascii="Times New Roman" w:eastAsia="Times New Roman" w:hAnsi="Times New Roman" w:cs="Times New Roman"/>
           <w:sz w:val="24"/>
         </w:rPr>
-        <w:t>Humidity ranks third even though its correlation with the target is weak (−0.207). The tree most likely uses it to separate rainy and foggy hours, an effect</w:t>
-      </w:r>
-      <w:r>
-        <w:rPr>
-          <w:rFonts w:ascii="Times New Roman" w:eastAsia="Times New Roman" w:hAnsi="Times New Roman" w:cs="Times New Roman"/>
-          <w:sz w:val="24"/>
-        </w:rPr>
-        <w:t xml:space="preserve"> that a linear correlation does not capture.</w:t>
+        <w:t>Humidity ranks third even though its correlation with the target is weak (−0.207). The tree most likely uses it to separate rainy and foggy hours, an effect that a linear correlation does not capture.</w:t>
       </w:r>
     </w:p>
     <w:p>
@@ -5556,14 +5341,7 @@
           <w:rFonts w:ascii="Times New Roman" w:eastAsia="Times New Roman" w:hAnsi="Times New Roman" w:cs="Times New Roman"/>
           <w:sz w:val="24"/>
         </w:rPr>
-        <w:t xml:space="preserve"> the unpruned tree reaches 100% training accuracy </w:t>
-      </w:r>
-      <w:r>
-        <w:rPr>
-          <w:rFonts w:ascii="Times New Roman" w:eastAsia="Times New Roman" w:hAnsi="Times New Roman" w:cs="Times New Roman"/>
-          <w:sz w:val="24"/>
-        </w:rPr>
-        <w:t>(depth 24, 718 leaves) against 83.39% on the test set. This 16.6-point gap motivates a model with built-in regularisation (SVM, Section 6).</w:t>
+        <w:t xml:space="preserve"> the unpruned tree reaches 100% training accuracy (depth 24, 718 leaves) against 83.39% on the test set. This 16.6-point gap motivates a model with built-in regularisation (SVM, Section 6).</w:t>
       </w:r>
     </w:p>
     <w:p>
@@ -5589,21 +5367,7 @@
           <w:rFonts w:ascii="Times New Roman" w:eastAsia="Times New Roman" w:hAnsi="Times New Roman" w:cs="Times New Roman"/>
           <w:sz w:val="24"/>
         </w:rPr>
-        <w:t xml:space="preserve">Because the target is categorical, an SVM classifier (SVC) was used rather than </w:t>
-      </w:r>
-      <w:r>
-        <w:rPr>
-          <w:rFonts w:ascii="Times New Roman" w:eastAsia="Times New Roman" w:hAnsi="Times New Roman" w:cs="Times New Roman"/>
-          <w:sz w:val="24"/>
-        </w:rPr>
-        <w:t>SVR. The 21-feature normalised + engineered set (Set 3) was shuffled (random_state = 42), saved as shuffled_seoulbike.csv and used for all SVM experiments. Each model was evaluated in two ways: the same stratified 70/30 split and 5-fold cross-validation (C</w:t>
-      </w:r>
-      <w:r>
-        <w:rPr>
-          <w:rFonts w:ascii="Times New Roman" w:eastAsia="Times New Roman" w:hAnsi="Times New Roman" w:cs="Times New Roman"/>
-          <w:sz w:val="24"/>
-        </w:rPr>
-        <w:t>V).</w:t>
+        <w:t>Because the target is categorical, an SVM classifier (SVC) was used rather than SVR. The 21-feature normalised + engineered set (Set 3) was shuffled (random_state = 42), saved as shuffled_seoulbike.csv and used for all SVM experiments. Each model was evaluated in two ways: the same stratified 70/30 split and 5-fold cross-validation (CV).</w:t>
       </w:r>
     </w:p>
     <w:p>
@@ -5688,14 +5452,7 @@
           <w:rFonts w:ascii="Times New Roman" w:eastAsia="Times New Roman" w:hAnsi="Times New Roman" w:cs="Times New Roman"/>
           <w:sz w:val="24"/>
         </w:rPr>
-        <w:t xml:space="preserve"> (83.39%). The RBF kernel draws smooth, non-linear boundaries in the scaled feature space, w</w:t>
-      </w:r>
-      <w:r>
-        <w:rPr>
-          <w:rFonts w:ascii="Times New Roman" w:eastAsia="Times New Roman" w:hAnsi="Times New Roman" w:cs="Times New Roman"/>
-          <w:sz w:val="24"/>
-        </w:rPr>
-        <w:t>hich suits gradual effects such as temperature, while the margin-based C parameter regularises the model. The tree, by contrast, memorised the training data.</w:t>
+        <w:t xml:space="preserve"> (83.39%). The RBF kernel draws smooth, non-linear boundaries in the scaled feature space, which suits gradual effects such as temperature, while the margin-based C parameter regularises the model. The tree, by contrast, memorised the training data.</w:t>
       </w:r>
     </w:p>
     <w:p>
@@ -5712,14 +5469,7 @@
           <w:sz w:val="24"/>
         </w:rPr>
         <w:lastRenderedPageBreak/>
-        <w:t>The near-identical split and CV scores (difference 0.03 points) show the result does not depend on</w:t>
-      </w:r>
-      <w:r>
-        <w:rPr>
-          <w:rFonts w:ascii="Times New Roman" w:eastAsia="Times New Roman" w:hAnsi="Times New Roman" w:cs="Times New Roman"/>
-          <w:sz w:val="24"/>
-        </w:rPr>
-        <w:t xml:space="preserve"> one lucky split.</w:t>
+        <w:t>The near-identical split and CV scores (difference 0.03 points) show the result does not depend on one lucky split.</w:t>
       </w:r>
     </w:p>
     <w:p>
@@ -6006,14 +5756,7 @@
           <w:rFonts w:ascii="Times New Roman" w:eastAsia="Times New Roman" w:hAnsi="Times New Roman" w:cs="Times New Roman"/>
           <w:sz w:val="24"/>
         </w:rPr>
-        <w:t xml:space="preserve"> the linear kernel is about 7 points below RBF and polynomial, confirming that the demand classes are not linearly separable. This is consistent with the non-linear daily and seasonal patterns in P1 §4. The sigmoid kernel performs poorly (54.66%) because i</w:t>
-      </w:r>
-      <w:r>
-        <w:rPr>
-          <w:rFonts w:ascii="Times New Roman" w:eastAsia="Times New Roman" w:hAnsi="Times New Roman" w:cs="Times New Roman"/>
-          <w:sz w:val="24"/>
-        </w:rPr>
-        <w:t>t is not positive semi-definite for most parameter values and is rarely suited to tabular data. RBF and poly are equivalent (≈ 85.2%).</w:t>
+        <w:t xml:space="preserve"> the linear kernel is about 7 points below RBF and polynomial, confirming that the demand classes are not linearly separable. This is consistent with the non-linear daily and seasonal patterns in P1 §4. The sigmoid kernel performs poorly (54.66%) because it is not positive semi-definite for most parameter values and is rarely suited to tabular data. RBF and poly are equivalent (≈ 85.2%).</w:t>
       </w:r>
     </w:p>
     <w:p>
@@ -6037,14 +5780,7 @@
           <w:rFonts w:ascii="Times New Roman" w:eastAsia="Times New Roman" w:hAnsi="Times New Roman" w:cs="Times New Roman"/>
           <w:sz w:val="24"/>
         </w:rPr>
-        <w:t xml:space="preserve"> GridSearchCV (5-fold) over C ∈ {0.1, 1, 10, 100} and gamma ∈ {'scale', 0.01, 0.1, 1} with the RBF kernel (16</w:t>
-      </w:r>
-      <w:r>
-        <w:rPr>
-          <w:rFonts w:ascii="Times New Roman" w:eastAsia="Times New Roman" w:hAnsi="Times New Roman" w:cs="Times New Roman"/>
-          <w:sz w:val="24"/>
-        </w:rPr>
-        <w:t xml:space="preserve"> combinations, 80 fits). C controls regularisation and gamma controls how local each support vector's influence is, so these are the two parameters that matter most for RBF-SVM.</w:t>
+        <w:t xml:space="preserve"> GridSearchCV (5-fold) over C ∈ {0.1, 1, 10, 100} and gamma ∈ {'scale', 0.01, 0.1, 1} with the RBF kernel (16 combinations, 80 fits). C controls regularisation and gamma controls how local each support vector's influence is, so these are the two parameters that matter most for RBF-SVM.</w:t>
       </w:r>
     </w:p>
     <w:p>
@@ -6083,14 +5819,7 @@
           <w:rFonts w:ascii="Times New Roman" w:eastAsia="Times New Roman" w:hAnsi="Times New Roman" w:cs="Times New Roman"/>
           <w:sz w:val="24"/>
         </w:rPr>
-        <w:t xml:space="preserve"> (scale = 1 / (n_features × variance </w:t>
-      </w:r>
-      <w:r>
-        <w:rPr>
-          <w:rFonts w:ascii="Times New Roman" w:eastAsia="Times New Roman" w:hAnsi="Times New Roman" w:cs="Times New Roman"/>
-          <w:sz w:val="24"/>
-        </w:rPr>
-        <w:t>of X)).</w:t>
+        <w:t xml:space="preserve"> (scale = 1 / (n_features × variance of X)).</w:t>
       </w:r>
     </w:p>
     <w:p>
@@ -6198,14 +5927,7 @@
           <w:rFonts w:ascii="Times New Roman" w:eastAsia="Times New Roman" w:hAnsi="Times New Roman" w:cs="Times New Roman"/>
           <w:sz w:val="24"/>
         </w:rPr>
-        <w:t xml:space="preserve"> a large C means weak regularisation, allowing a more complex boundary. With 8,448 samples and 21 features the data su</w:t>
-      </w:r>
-      <w:r>
-        <w:rPr>
-          <w:rFonts w:ascii="Times New Roman" w:eastAsia="Times New Roman" w:hAnsi="Times New Roman" w:cs="Times New Roman"/>
-          <w:sz w:val="24"/>
-        </w:rPr>
-        <w:t>pports this; the small gap between split and CV accuracy (0.61 points) suggests the model is not heavily overfitting.</w:t>
+        <w:t xml:space="preserve"> a large C means weak regularisation, allowing a more complex boundary. With 8,448 samples and 21 features the data supports this; the small gap between split and CV accuracy (0.61 points) suggests the model is not heavily overfitting.</w:t>
       </w:r>
     </w:p>
     <w:p>
@@ -6305,15 +6027,7 @@
           <w:i/>
           <w:sz w:val="20"/>
         </w:rPr>
-        <w:t>Figure 4. 5-fold CV accuracy of the tuned SVM for different numbers of se</w:t>
-      </w:r>
-      <w:r>
-        <w:rPr>
-          <w:rFonts w:ascii="Times New Roman" w:eastAsia="Times New Roman" w:hAnsi="Times New Roman" w:cs="Times New Roman"/>
-          <w:i/>
-          <w:sz w:val="20"/>
-        </w:rPr>
-        <w:t>lected features K</w:t>
+        <w:t>Figure 4. 5-fold CV accuracy of the tuned SVM for different numbers of selected features K</w:t>
       </w:r>
     </w:p>
     <w:p>
@@ -6352,14 +6066,7 @@
           <w:rFonts w:ascii="Times New Roman" w:eastAsia="Times New Roman" w:hAnsi="Times New Roman" w:cs="Times New Roman"/>
           <w:sz w:val="24"/>
         </w:rPr>
-        <w:t xml:space="preserve"> is the elbow of the curve: it halves</w:t>
-      </w:r>
-      <w:r>
-        <w:rPr>
-          <w:rFonts w:ascii="Times New Roman" w:eastAsia="Times New Roman" w:hAnsi="Times New Roman" w:cs="Times New Roman"/>
-          <w:sz w:val="24"/>
-        </w:rPr>
-        <w:t xml:space="preserve"> the number of inputs while keeping most of the gain, and it matches the 10 PCA components in Section 9, making the two reduction methods directly comparable.</w:t>
+        <w:t xml:space="preserve"> is the elbow of the curve: it halves the number of inputs while keeping most of the gain, and it matches the 10 PCA components in Section 9, making the two reduction methods directly comparable.</w:t>
       </w:r>
     </w:p>
     <w:p>
@@ -6407,14 +6114,7 @@
           <w:rFonts w:ascii="Times New Roman" w:eastAsia="Times New Roman" w:hAnsi="Times New Roman" w:cs="Times New Roman"/>
           <w:sz w:val="24"/>
         </w:rPr>
-        <w:t xml:space="preserve"> humidity, wind_speed, visibility, rainfall, snowfall, holiday, season_Autumn, season_Spring, hour_cos, is_we</w:t>
-      </w:r>
-      <w:r>
-        <w:rPr>
-          <w:rFonts w:ascii="Times New Roman" w:eastAsia="Times New Roman" w:hAnsi="Times New Roman" w:cs="Times New Roman"/>
-          <w:sz w:val="24"/>
-        </w:rPr>
-        <w:t>ekend, daily_rainfall.</w:t>
+        <w:t xml:space="preserve"> humidity, wind_speed, visibility, rainfall, snowfall, holiday, season_Autumn, season_Spring, hour_cos, is_weekend, daily_rainfall.</w:t>
       </w:r>
     </w:p>
     <w:p>
@@ -6492,21 +6192,7 @@
           <w:rFonts w:ascii="Times New Roman" w:eastAsia="Times New Roman" w:hAnsi="Times New Roman" w:cs="Times New Roman"/>
           <w:sz w:val="24"/>
         </w:rPr>
-        <w:t xml:space="preserve"> the F-test scores each feature on its own. It keeps redundant features (temperature, dew point and temp_x_hour </w:t>
-      </w:r>
-      <w:r>
-        <w:rPr>
-          <w:rFonts w:ascii="Times New Roman" w:eastAsia="Times New Roman" w:hAnsi="Times New Roman" w:cs="Times New Roman"/>
-          <w:sz w:val="24"/>
-        </w:rPr>
-        <w:t xml:space="preserve">all describe warmth) and drops features that are weak alone but useful in combination. Humidity, for example, was dropped although it was the third most important feature for the Decision Tree (Figure 3). The sweep shows accuracy keeps rising up to all 21 </w:t>
-      </w:r>
-      <w:r>
-        <w:rPr>
-          <w:rFonts w:ascii="Times New Roman" w:eastAsia="Times New Roman" w:hAnsi="Times New Roman" w:cs="Times New Roman"/>
-          <w:sz w:val="24"/>
-        </w:rPr>
-        <w:t>features, so every feature adds some information for the RBF-SVM.</w:t>
+        <w:t xml:space="preserve"> the F-test scores each feature on its own. It keeps redundant features (temperature, dew point and temp_x_hour all describe warmth) and drops features that are weak alone but useful in combination. Humidity, for example, was dropped although it was the third most important feature for the Decision Tree (Figure 3). The sweep shows accuracy keeps rising up to all 21 features, so every feature adds some information for the RBF-SVM.</w:t>
       </w:r>
     </w:p>
     <w:p>
@@ -6606,14 +6292,7 @@
           <w:rFonts w:ascii="Times New Roman" w:eastAsia="Times New Roman" w:hAnsi="Times New Roman" w:cs="Times New Roman"/>
           <w:sz w:val="24"/>
         </w:rPr>
-        <w:t xml:space="preserve"> PC1 explains 37.8% and PC2 24.7% of the variance</w:t>
-      </w:r>
-      <w:r>
-        <w:rPr>
-          <w:rFonts w:ascii="Times New Roman" w:eastAsia="Times New Roman" w:hAnsi="Times New Roman" w:cs="Times New Roman"/>
-          <w:sz w:val="24"/>
-        </w:rPr>
-        <w:t xml:space="preserve"> (62.5% together); the curve then flattens, with each component after PC5 adding less than 4%.</w:t>
+        <w:t xml:space="preserve"> PC1 explains 37.8% and PC2 24.7% of the variance (62.5% together); the curve then flattens, with each component after PC5 adding less than 4%.</w:t>
       </w:r>
     </w:p>
     <w:p>
@@ -6652,14 +6331,7 @@
           <w:rFonts w:ascii="Times New Roman" w:eastAsia="Times New Roman" w:hAnsi="Times New Roman" w:cs="Times New Roman"/>
           <w:sz w:val="24"/>
         </w:rPr>
-        <w:t>. Components 11–21 add only</w:t>
-      </w:r>
-      <w:r>
-        <w:rPr>
-          <w:rFonts w:ascii="Times New Roman" w:eastAsia="Times New Roman" w:hAnsi="Times New Roman" w:cs="Times New Roman"/>
-          <w:sz w:val="24"/>
-        </w:rPr>
-        <w:t xml:space="preserve"> 4.4% in total and mostly carry noise and redundant information from correlated pairs such as temperature–dew point.</w:t>
+        <w:t>. Components 11–21 add only 4.4% in total and mostly carry noise and redundant information from correlated pairs such as temperature–dew point.</w:t>
       </w:r>
     </w:p>
     <w:p>
@@ -6728,14 +6400,7 @@
           <w:rFonts w:ascii="Times New Roman" w:eastAsia="Times New Roman" w:hAnsi="Times New Roman" w:cs="Times New Roman"/>
           <w:sz w:val="24"/>
         </w:rPr>
-        <w:t xml:space="preserve"> the tuned SVM while using half as many inp</w:t>
-      </w:r>
-      <w:r>
-        <w:rPr>
-          <w:rFonts w:ascii="Times New Roman" w:eastAsia="Times New Roman" w:hAnsi="Times New Roman" w:cs="Times New Roman"/>
-          <w:sz w:val="24"/>
-        </w:rPr>
-        <w:t>uts.</w:t>
+        <w:t xml:space="preserve"> the tuned SVM while using half as many inputs.</w:t>
       </w:r>
     </w:p>
     <w:p>
@@ -6783,14 +6448,7 @@
           <w:rFonts w:ascii="Times New Roman" w:eastAsia="Times New Roman" w:hAnsi="Times New Roman" w:cs="Times New Roman"/>
           <w:sz w:val="24"/>
         </w:rPr>
-        <w:t xml:space="preserve"> PCA components are linear mix</w:t>
-      </w:r>
-      <w:r>
-        <w:rPr>
-          <w:rFonts w:ascii="Times New Roman" w:eastAsia="Times New Roman" w:hAnsi="Times New Roman" w:cs="Times New Roman"/>
-          <w:sz w:val="24"/>
-        </w:rPr>
-        <w:t>tures of features, so they lose the physical meaning that operators need to explain a prediction. With only 21 features, the full feature set is preferred here.</w:t>
+        <w:t xml:space="preserve"> PCA components are linear mixtures of features, so they lose the physical meaning that operators need to explain a prediction. With only 21 features, the full feature set is preferred here.</w:t>
       </w:r>
     </w:p>
     <w:p>
@@ -6818,15 +6476,7 @@
           <w:b/>
           <w:sz w:val="20"/>
         </w:rPr>
-        <w:t>Table 6. Final summary of the four SVM variations (stratifi</w:t>
-      </w:r>
-      <w:r>
-        <w:rPr>
-          <w:rFonts w:ascii="Times New Roman" w:eastAsia="Times New Roman" w:hAnsi="Times New Roman" w:cs="Times New Roman"/>
-          <w:b/>
-          <w:sz w:val="20"/>
-        </w:rPr>
-        <w:t>ed 70/30 split and 5-fold CV)</w:t>
+        <w:t>Table 6. Final summary of the four SVM variations (stratified 70/30 split and 5-fold CV)</w:t>
       </w:r>
     </w:p>
     <w:tbl>
@@ -7250,15 +6900,7 @@
           <w:b/>
           <w:sz w:val="24"/>
         </w:rPr>
-        <w:t>8</w:t>
-      </w:r>
-      <w:r>
-        <w:rPr>
-          <w:rFonts w:ascii="Times New Roman" w:eastAsia="Times New Roman" w:hAnsi="Times New Roman" w:cs="Times New Roman"/>
-          <w:b/>
-          <w:sz w:val="24"/>
-        </w:rPr>
-        <w:t>8.13% (split) / 87.52% (CV)</w:t>
+        <w:t>88.13% (split) / 87.52% (CV)</w:t>
       </w:r>
       <w:r>
         <w:rPr>
@@ -7289,14 +6931,7 @@
           <w:rFonts w:ascii="Times New Roman" w:eastAsia="Times New Roman" w:hAnsi="Times New Roman" w:cs="Times New Roman"/>
           <w:sz w:val="24"/>
         </w:rPr>
-        <w:t xml:space="preserve"> (1) feature engineering (+4.34 points for trees), (2) switching to a regularised, non-linear SV</w:t>
-      </w:r>
-      <w:r>
-        <w:rPr>
-          <w:rFonts w:ascii="Times New Roman" w:eastAsia="Times New Roman" w:hAnsi="Times New Roman" w:cs="Times New Roman"/>
-          <w:sz w:val="24"/>
-        </w:rPr>
-        <w:t>M (+1.82), (3) hyperparameter tuning (+2.92). Reducing the inputs, by selection or PCA, lowered accuracy in every case.</w:t>
+        <w:t xml:space="preserve"> (1) feature engineering (+4.34 points for trees), (2) switching to a regularised, non-linear SVM (+1.82), (3) hyperparameter tuning (+2.92). Reducing the inputs, by selection or PCA, lowered accuracy in every case.</w:t>
       </w:r>
     </w:p>
     <w:p>
@@ -7337,15 +6972,7 @@
           <w:b/>
           <w:sz w:val="24"/>
         </w:rPr>
-        <w:t>Engineer</w:t>
-      </w:r>
-      <w:r>
-        <w:rPr>
-          <w:rFonts w:ascii="Times New Roman" w:eastAsia="Times New Roman" w:hAnsi="Times New Roman" w:cs="Times New Roman"/>
-          <w:b/>
-          <w:sz w:val="24"/>
-        </w:rPr>
-        <w:t>ing interpretation:</w:t>
+        <w:t>Engineering interpretation:</w:t>
       </w:r>
       <w:r>
         <w:rPr>
@@ -7414,14 +7041,7 @@
           <w:rFonts w:ascii="Times New Roman" w:eastAsia="Times New Roman" w:hAnsi="Times New Roman" w:cs="Times New Roman"/>
           <w:sz w:val="24"/>
         </w:rPr>
-        <w:t xml:space="preserve"> (especially temp_x_hour</w:t>
-      </w:r>
-      <w:r>
-        <w:rPr>
-          <w:rFonts w:ascii="Times New Roman" w:eastAsia="Times New Roman" w:hAnsi="Times New Roman" w:cs="Times New Roman"/>
-          <w:sz w:val="24"/>
-        </w:rPr>
-        <w:t>, rush_workday and is_raining) in any future model; they gave the largest single improvement.</w:t>
+        <w:t xml:space="preserve"> (especially temp_x_hour, rush_workday and is_raining) in any future model; they gave the largest single improvement.</w:t>
       </w:r>
     </w:p>
     <w:p>
@@ -7445,14 +7065,7 @@
           <w:rFonts w:ascii="Times New Roman" w:eastAsia="Times New Roman" w:hAnsi="Times New Roman" w:cs="Times New Roman"/>
           <w:sz w:val="24"/>
         </w:rPr>
-        <w:t>, accepting about 1.4 points lower accuracy and less interpretability. Do not use u</w:t>
-      </w:r>
-      <w:r>
-        <w:rPr>
-          <w:rFonts w:ascii="Times New Roman" w:eastAsia="Times New Roman" w:hAnsi="Times New Roman" w:cs="Times New Roman"/>
-          <w:sz w:val="24"/>
-        </w:rPr>
-        <w:t>nivariate K-Best selection for this dataset.</w:t>
+        <w:t>, accepting about 1.4 points lower accuracy and less interpretability. Do not use univariate K-Best selection for this dataset.</w:t>
       </w:r>
     </w:p>
     <w:p>
@@ -7539,14 +7152,7 @@
           <w:rFonts w:ascii="Times New Roman" w:eastAsia="Times New Roman" w:hAnsi="Times New Roman" w:cs="Times New Roman"/>
           <w:sz w:val="24"/>
         </w:rPr>
-        <w:t xml:space="preserve"> ra</w:t>
-      </w:r>
-      <w:r>
-        <w:rPr>
-          <w:rFonts w:ascii="Times New Roman" w:eastAsia="Times New Roman" w:hAnsi="Times New Roman" w:cs="Times New Roman"/>
-          <w:sz w:val="24"/>
-        </w:rPr>
-        <w:t>infall and snowfall have an IQR of 0, so RobustScaler would divide by zero; log1p + MinMaxScaler was used instead, and the binary is_raining flag captures the presence of rain.</w:t>
+        <w:t xml:space="preserve"> rainfall and snowfall have an IQR of 0, so RobustScaler would divide by zero; log1p + MinMaxScaler was used instead, and the binary is_raining flag captures the presence of rain.</w:t>
       </w:r>
     </w:p>
     <w:p>
@@ -7570,14 +7176,7 @@
           <w:rFonts w:ascii="Times New Roman" w:eastAsia="Times New Roman" w:hAnsi="Times New Roman" w:cs="Times New Roman"/>
           <w:sz w:val="24"/>
         </w:rPr>
-        <w:t xml:space="preserve"> temp_x_hour and hour_sin are strongly correlated</w:t>
-      </w:r>
-      <w:r>
-        <w:rPr>
-          <w:rFonts w:ascii="Times New Roman" w:eastAsia="Times New Roman" w:hAnsi="Times New Roman" w:cs="Times New Roman"/>
-          <w:sz w:val="24"/>
-        </w:rPr>
-        <w:t xml:space="preserve"> with their source features, which made the correlation-based "top 5" set worse than expected and had to be explained rather than assumed to help.</w:t>
+        <w:t xml:space="preserve"> temp_x_hour and hour_sin are strongly correlated with their source features, which made the correlation-based "top 5" set worse than expected and had to be explained rather than assumed to help.</w:t>
       </w:r>
     </w:p>
     <w:p>
@@ -7601,14 +7200,7 @@
           <w:rFonts w:ascii="Times New Roman" w:eastAsia="Times New Roman" w:hAnsi="Times New Roman" w:cs="Times New Roman"/>
           <w:sz w:val="24"/>
         </w:rPr>
-        <w:t xml:space="preserve"> the SVM grid search (16 combinations × 5 folds) is much slower than trees, so the grid was </w:t>
-      </w:r>
-      <w:r>
-        <w:rPr>
-          <w:rFonts w:ascii="Times New Roman" w:eastAsia="Times New Roman" w:hAnsi="Times New Roman" w:cs="Times New Roman"/>
-          <w:sz w:val="24"/>
-        </w:rPr>
-        <w:t>limited to the RBF kernel after the kernel comparison.</w:t>
+        <w:t xml:space="preserve"> the SVM grid search (16 combinations × 5 folds) is much slower than trees, so the grid was limited to the RBF kernel after the kernel comparison.</w:t>
       </w:r>
     </w:p>
     <w:p>
@@ -7646,15 +7238,7 @@
           <w:b/>
           <w:sz w:val="26"/>
         </w:rPr>
-        <w:t>12. Refl</w:t>
-      </w:r>
-      <w:r>
-        <w:rPr>
-          <w:rFonts w:ascii="Times New Roman" w:eastAsia="Times New Roman" w:hAnsi="Times New Roman" w:cs="Times New Roman"/>
-          <w:b/>
-          <w:sz w:val="26"/>
-        </w:rPr>
-        <w:t>ection &amp; Limitations</w:t>
+        <w:t>12. Reflection &amp; Limitations</w:t>
       </w:r>
     </w:p>
     <w:p>
@@ -7692,14 +7276,7 @@
           <w:rFonts w:ascii="Times New Roman" w:eastAsia="Times New Roman" w:hAnsi="Times New Roman" w:cs="Times New Roman"/>
           <w:sz w:val="24"/>
         </w:rPr>
-        <w:t xml:space="preserve"> neighbouring hours of the same day can appear in both training and test sets, so the model partly sees the conditions it is tested on. A chrono</w:t>
-      </w:r>
-      <w:r>
-        <w:rPr>
-          <w:rFonts w:ascii="Times New Roman" w:eastAsia="Times New Roman" w:hAnsi="Times New Roman" w:cs="Times New Roman"/>
-          <w:sz w:val="24"/>
-        </w:rPr>
-        <w:t>logical split (e.g. train on the first 10 months, test on the last 2) would better reflect real forecasting.</w:t>
+        <w:t xml:space="preserve"> neighbouring hours of the same day can appear in both training and test sets, so the model partly sees the conditions it is tested on. A chronological split (e.g. train on the first 10 months, test on the last 2) would better reflect real forecasting.</w:t>
       </w:r>
     </w:p>
     <w:p>
@@ -7723,14 +7300,7 @@
           <w:rFonts w:ascii="Times New Roman" w:eastAsia="Times New Roman" w:hAnsi="Times New Roman" w:cs="Times New Roman"/>
           <w:sz w:val="24"/>
         </w:rPr>
-        <w:t xml:space="preserve"> scalers and the engineered-feature scalers were fitted on the full dataset before splitting. The leakage is minor for distributi</w:t>
-      </w:r>
-      <w:r>
-        <w:rPr>
-          <w:rFonts w:ascii="Times New Roman" w:eastAsia="Times New Roman" w:hAnsi="Times New Roman" w:cs="Times New Roman"/>
-          <w:sz w:val="24"/>
-        </w:rPr>
-        <w:t>on statistics, but fitting them inside a Pipeline would be more rigorous.</w:t>
+        <w:t xml:space="preserve"> scalers and the engineered-feature scalers were fitted on the full dataset before splitting. The leakage is minor for distribution statistics, but fitting them inside a Pipeline would be more rigorous.</w:t>
       </w:r>
     </w:p>
     <w:p>
@@ -7754,14 +7324,7 @@
           <w:rFonts w:ascii="Times New Roman" w:eastAsia="Times New Roman" w:hAnsi="Times New Roman" w:cs="Times New Roman"/>
           <w:sz w:val="24"/>
         </w:rPr>
-        <w:t xml:space="preserve"> it sums rainfall over the whole day, including hours after the prediction time. In a real-time system it should be replaced by forecast rainfa</w:t>
-      </w:r>
-      <w:r>
-        <w:rPr>
-          <w:rFonts w:ascii="Times New Roman" w:eastAsia="Times New Roman" w:hAnsi="Times New Roman" w:cs="Times New Roman"/>
-          <w:sz w:val="24"/>
-        </w:rPr>
-        <w:t>ll or rainfall up to the current hour.</w:t>
+        <w:t xml:space="preserve"> it sums rainfall over the whole day, including hours after the prediction time. In a real-time system it should be replaced by forecast rainfall or rainfall up to the current hour.</w:t>
       </w:r>
     </w:p>
     <w:p>
@@ -7831,14 +7394,7 @@
           <w:rFonts w:ascii="Times New Roman" w:eastAsia="Times New Roman" w:hAnsi="Times New Roman" w:cs="Times New Roman"/>
           <w:sz w:val="24"/>
         </w:rPr>
-        <w:t>Demand is city-wide, so the model cannot guarantee fair service acro</w:t>
-      </w:r>
-      <w:r>
-        <w:rPr>
-          <w:rFonts w:ascii="Times New Roman" w:eastAsia="Times New Roman" w:hAnsi="Times New Roman" w:cs="Times New Roman"/>
-          <w:sz w:val="24"/>
-        </w:rPr>
-        <w:t>ss neighbourhoods; station-level data would be needed before using it for allocation decisions.</w:t>
+        <w:t>Demand is city-wide, so the model cannot guarantee fair service across neighbourhoods; station-level data would be needed before using it for allocation decisions.</w:t>
       </w:r>
     </w:p>
     <w:p>
@@ -7855,14 +7411,7 @@
           <w:sz w:val="24"/>
         </w:rPr>
         <w:lastRenderedPageBreak/>
-        <w:t>The SVM is less interpretable than a tree. For operational trust, its predictions should be explained (e.g. with permutation importance) and monitored for drift</w:t>
-      </w:r>
-      <w:r>
-        <w:rPr>
-          <w:rFonts w:ascii="Times New Roman" w:eastAsia="Times New Roman" w:hAnsi="Times New Roman" w:cs="Times New Roman"/>
-          <w:sz w:val="24"/>
-        </w:rPr>
-        <w:t xml:space="preserve"> as travel habits change.</w:t>
+        <w:t>The SVM is less interpretable than a tree. For operational trust, its predictions should be explained (e.g. with permutation importance) and monitored for drift as travel habits change.</w:t>
       </w:r>
     </w:p>
     <w:p>
@@ -7908,14 +7457,7 @@
           <w:rFonts w:ascii="Times New Roman" w:eastAsia="Times New Roman" w:hAnsi="Times New Roman" w:cs="Times New Roman"/>
           <w:sz w:val="24"/>
         </w:rPr>
-        <w:t>Report a confusion matrix and per-class precision/</w:t>
-      </w:r>
-      <w:r>
-        <w:rPr>
-          <w:rFonts w:ascii="Times New Roman" w:eastAsia="Times New Roman" w:hAnsi="Times New Roman" w:cs="Times New Roman"/>
-          <w:sz w:val="24"/>
-        </w:rPr>
-        <w:t>recall, to check that errors are mainly between adjacent classes (Low↔Medium, Medium↔High) rather than Low↔High.</w:t>
+        <w:t>Report a confusion matrix and per-class precision/recall, to check that errors are mainly between adjacent classes (Low↔Medium, Medium↔High) rather than Low↔High.</w:t>
       </w:r>
     </w:p>
     <w:p>
@@ -7931,14 +7473,7 @@
           <w:rFonts w:ascii="Times New Roman" w:eastAsia="Times New Roman" w:hAnsi="Times New Roman" w:cs="Times New Roman"/>
           <w:sz w:val="24"/>
         </w:rPr>
-        <w:t>Compare with ensemble models (Random Forest, Gradient Boosting), which often match SVM accuracy on tabular data while remaining more interpreta</w:t>
-      </w:r>
-      <w:r>
-        <w:rPr>
-          <w:rFonts w:ascii="Times New Roman" w:eastAsia="Times New Roman" w:hAnsi="Times New Roman" w:cs="Times New Roman"/>
-          <w:sz w:val="24"/>
-        </w:rPr>
-        <w:t>ble through feature importance.</w:t>
+        <w:t>Compare with ensemble models (Random Forest, Gradient Boosting), which often match SVM accuracy on tabular data while remaining more interpretable through feature importance.</w:t>
       </w:r>
     </w:p>
     <w:p>
@@ -7980,36 +7515,13 @@
           <w:rFonts w:ascii="Times New Roman" w:eastAsia="Times New Roman" w:hAnsi="Times New Roman" w:cs="Times New Roman"/>
           <w:sz w:val="24"/>
         </w:rPr>
-        <w:t xml:space="preserve">I used Claude (Anthropic) to assist with debugging code, suggesting </w:t>
-      </w:r>
-      <w:r>
-        <w:rPr>
-          <w:rFonts w:ascii="Times New Roman" w:eastAsia="Times New Roman" w:hAnsi="Times New Roman" w:cs="Times New Roman"/>
-          <w:sz w:val="24"/>
-        </w:rPr>
-        <w:t>feature-engineering ideas, and drafting and formatting this report from my notebook results. All code was run by me, and all results, interpretations and conclusions were checked against my notebook outputs and are my own work.</w:t>
+        <w:t>I used Claude (Anthropic) to assist with debugging code, suggesting feature-engineering ideas, and drafting and formatting this report from my notebook results. All code was run by me, and all results, interpretations and conclusions were checked against my notebook outputs and are my own work.</w:t>
       </w:r>
     </w:p>
     <w:p>
       <w:pPr>
         <w:spacing w:after="120" w:line="276" w:lineRule="auto"/>
       </w:pPr>
-      <w:r>
-        <w:rPr>
-          <w:rFonts w:ascii="Times New Roman" w:eastAsia="Times New Roman" w:hAnsi="Times New Roman" w:cs="Times New Roman"/>
-          <w:i/>
-          <w:sz w:val="24"/>
-        </w:rPr>
-        <w:t>[Insert screenshots of my in</w:t>
-      </w:r>
-      <w:r>
-        <w:rPr>
-          <w:rFonts w:ascii="Times New Roman" w:eastAsia="Times New Roman" w:hAnsi="Times New Roman" w:cs="Times New Roman"/>
-          <w:i/>
-          <w:sz w:val="24"/>
-        </w:rPr>
-        <w:t>teractions with Claude here as proof.]</w:t>
-      </w:r>
     </w:p>
     <w:sectPr>
       <w:headerReference w:type="even" r:id="rId17"/>

</xml_diff>